<commit_message>
update security design doc
</commit_message>
<xml_diff>
--- a/docs/security_design.docx
+++ b/docs/security_design.docx
@@ -319,7 +319,23 @@
                 <w:sz w:val="19"/>
                 <w:szCs w:val="19"/>
               </w:rPr>
-              <w:t xml:space="preserve">   — URL dispatch, HTML rendering</w:t>
+              <w:t xml:space="preserve">   </w:t>
+            </w:r>
+            <w:r>
+              <w:rPr>
+                <w:color w:val="595959"/>
+                <w:sz w:val="19"/>
+                <w:szCs w:val="19"/>
+              </w:rPr>
+              <w:t>-</w:t>
+            </w:r>
+            <w:r>
+              <w:rPr>
+                <w:color w:val="595959"/>
+                <w:sz w:val="19"/>
+                <w:szCs w:val="19"/>
+              </w:rPr>
+              <w:t xml:space="preserve"> URL dispatch, HTML rendering</w:t>
             </w:r>
           </w:p>
           <w:p>
@@ -372,7 +388,23 @@
                 <w:sz w:val="19"/>
                 <w:szCs w:val="19"/>
               </w:rPr>
-              <w:t xml:space="preserve">   — Authentication &amp; RBAC gate</w:t>
+              <w:t xml:space="preserve">   </w:t>
+            </w:r>
+            <w:r>
+              <w:rPr>
+                <w:color w:val="595959"/>
+                <w:sz w:val="19"/>
+                <w:szCs w:val="19"/>
+              </w:rPr>
+              <w:t>-</w:t>
+            </w:r>
+            <w:r>
+              <w:rPr>
+                <w:color w:val="595959"/>
+                <w:sz w:val="19"/>
+                <w:szCs w:val="19"/>
+              </w:rPr>
+              <w:t xml:space="preserve"> Authentication &amp; RBAC gate</w:t>
             </w:r>
           </w:p>
           <w:p>
@@ -425,7 +457,23 @@
                 <w:sz w:val="19"/>
                 <w:szCs w:val="19"/>
               </w:rPr>
-              <w:t xml:space="preserve">   — Session validation &amp; timeout</w:t>
+              <w:t xml:space="preserve">   </w:t>
+            </w:r>
+            <w:r>
+              <w:rPr>
+                <w:color w:val="595959"/>
+                <w:sz w:val="19"/>
+                <w:szCs w:val="19"/>
+              </w:rPr>
+              <w:t>-</w:t>
+            </w:r>
+            <w:r>
+              <w:rPr>
+                <w:color w:val="595959"/>
+                <w:sz w:val="19"/>
+                <w:szCs w:val="19"/>
+              </w:rPr>
+              <w:t xml:space="preserve"> Session validation &amp; timeout</w:t>
             </w:r>
           </w:p>
           <w:p>
@@ -477,7 +525,15 @@
                 <w:sz w:val="19"/>
                 <w:szCs w:val="19"/>
               </w:rPr>
-              <w:t>— Encrypt/decrypt all documents</w:t>
+              <w:t>-</w:t>
+            </w:r>
+            <w:r>
+              <w:rPr>
+                <w:color w:val="595959"/>
+                <w:sz w:val="19"/>
+                <w:szCs w:val="19"/>
+              </w:rPr>
+              <w:t xml:space="preserve"> Encrypt/decrypt all documents</w:t>
             </w:r>
           </w:p>
           <w:p>
@@ -521,7 +577,23 @@
                 <w:sz w:val="19"/>
                 <w:szCs w:val="19"/>
               </w:rPr>
-              <w:t xml:space="preserve">   — Structured JSON event logging</w:t>
+              <w:t xml:space="preserve">   </w:t>
+            </w:r>
+            <w:r>
+              <w:rPr>
+                <w:color w:val="595959"/>
+                <w:sz w:val="19"/>
+                <w:szCs w:val="19"/>
+              </w:rPr>
+              <w:t>-</w:t>
+            </w:r>
+            <w:r>
+              <w:rPr>
+                <w:color w:val="595959"/>
+                <w:sz w:val="19"/>
+                <w:szCs w:val="19"/>
+              </w:rPr>
+              <w:t xml:space="preserve"> Structured JSON event logging</w:t>
             </w:r>
           </w:p>
           <w:p>
@@ -584,7 +656,15 @@
                 <w:sz w:val="19"/>
                 <w:szCs w:val="19"/>
               </w:rPr>
-              <w:t>— In-memory IP rate limiting</w:t>
+              <w:t>-</w:t>
+            </w:r>
+            <w:r>
+              <w:rPr>
+                <w:color w:val="595959"/>
+                <w:sz w:val="19"/>
+                <w:szCs w:val="19"/>
+              </w:rPr>
+              <w:t xml:space="preserve"> In-memory IP rate limiting</w:t>
             </w:r>
           </w:p>
           <w:p>
@@ -637,7 +717,23 @@
                 <w:sz w:val="19"/>
                 <w:szCs w:val="19"/>
               </w:rPr>
-              <w:t xml:space="preserve">   — CSP, HSTS, X-Frame-Options, etc.</w:t>
+              <w:t xml:space="preserve">   </w:t>
+            </w:r>
+            <w:r>
+              <w:rPr>
+                <w:color w:val="595959"/>
+                <w:sz w:val="19"/>
+                <w:szCs w:val="19"/>
+              </w:rPr>
+              <w:t>-</w:t>
+            </w:r>
+            <w:r>
+              <w:rPr>
+                <w:color w:val="595959"/>
+                <w:sz w:val="19"/>
+                <w:szCs w:val="19"/>
+              </w:rPr>
+              <w:t xml:space="preserve"> CSP, HSTS, X-Frame-Options, etc.</w:t>
             </w:r>
           </w:p>
         </w:tc>
@@ -728,7 +824,23 @@
                 <w:sz w:val="19"/>
                 <w:szCs w:val="19"/>
               </w:rPr>
-              <w:t xml:space="preserve">   — </w:t>
+              <w:t xml:space="preserve">   </w:t>
+            </w:r>
+            <w:r>
+              <w:rPr>
+                <w:color w:val="595959"/>
+                <w:sz w:val="19"/>
+                <w:szCs w:val="19"/>
+              </w:rPr>
+              <w:t>-</w:t>
+            </w:r>
+            <w:r>
+              <w:rPr>
+                <w:color w:val="595959"/>
+                <w:sz w:val="19"/>
+                <w:szCs w:val="19"/>
+              </w:rPr>
+              <w:t xml:space="preserve"> </w:t>
             </w:r>
             <w:proofErr w:type="spellStart"/>
             <w:r>
@@ -779,7 +891,23 @@
                 <w:sz w:val="19"/>
                 <w:szCs w:val="19"/>
               </w:rPr>
-              <w:t xml:space="preserve">   — Server-side session tokens &amp; timestamps</w:t>
+              <w:t xml:space="preserve">   </w:t>
+            </w:r>
+            <w:r>
+              <w:rPr>
+                <w:color w:val="595959"/>
+                <w:sz w:val="19"/>
+                <w:szCs w:val="19"/>
+              </w:rPr>
+              <w:t>-</w:t>
+            </w:r>
+            <w:r>
+              <w:rPr>
+                <w:color w:val="595959"/>
+                <w:sz w:val="19"/>
+                <w:szCs w:val="19"/>
+              </w:rPr>
+              <w:t xml:space="preserve"> Server-side session tokens &amp; timestamps</w:t>
             </w:r>
           </w:p>
           <w:p>
@@ -823,7 +951,23 @@
                 <w:sz w:val="19"/>
                 <w:szCs w:val="19"/>
               </w:rPr>
-              <w:t xml:space="preserve">   — Fernet-encrypted document blobs (base64)</w:t>
+              <w:t xml:space="preserve">   </w:t>
+            </w:r>
+            <w:r>
+              <w:rPr>
+                <w:color w:val="595959"/>
+                <w:sz w:val="19"/>
+                <w:szCs w:val="19"/>
+              </w:rPr>
+              <w:t>-</w:t>
+            </w:r>
+            <w:r>
+              <w:rPr>
+                <w:color w:val="595959"/>
+                <w:sz w:val="19"/>
+                <w:szCs w:val="19"/>
+              </w:rPr>
+              <w:t xml:space="preserve"> Fernet-encrypted document blobs (base64)</w:t>
             </w:r>
           </w:p>
           <w:p>
@@ -845,7 +989,23 @@
                 <w:sz w:val="19"/>
                 <w:szCs w:val="19"/>
               </w:rPr>
-              <w:t xml:space="preserve">   — Auth, access denied, lockout events</w:t>
+              <w:t xml:space="preserve">   </w:t>
+            </w:r>
+            <w:r>
+              <w:rPr>
+                <w:color w:val="595959"/>
+                <w:sz w:val="19"/>
+                <w:szCs w:val="19"/>
+              </w:rPr>
+              <w:t>-</w:t>
+            </w:r>
+            <w:r>
+              <w:rPr>
+                <w:color w:val="595959"/>
+                <w:sz w:val="19"/>
+                <w:szCs w:val="19"/>
+              </w:rPr>
+              <w:t xml:space="preserve"> Auth, access denied, lockout events</w:t>
             </w:r>
           </w:p>
           <w:p>
@@ -867,7 +1027,23 @@
                 <w:sz w:val="19"/>
                 <w:szCs w:val="19"/>
               </w:rPr>
-              <w:t xml:space="preserve">   — Normal document operations</w:t>
+              <w:t xml:space="preserve">   </w:t>
+            </w:r>
+            <w:r>
+              <w:rPr>
+                <w:color w:val="595959"/>
+                <w:sz w:val="19"/>
+                <w:szCs w:val="19"/>
+              </w:rPr>
+              <w:t>-</w:t>
+            </w:r>
+            <w:r>
+              <w:rPr>
+                <w:color w:val="595959"/>
+                <w:sz w:val="19"/>
+                <w:szCs w:val="19"/>
+              </w:rPr>
+              <w:t xml:space="preserve"> Normal document operations</w:t>
             </w:r>
           </w:p>
           <w:p>
@@ -891,7 +1067,23 @@
                 <w:sz w:val="19"/>
                 <w:szCs w:val="19"/>
               </w:rPr>
-              <w:t xml:space="preserve">   — Fernet symmetric key (local file)</w:t>
+              <w:t xml:space="preserve">   </w:t>
+            </w:r>
+            <w:r>
+              <w:rPr>
+                <w:color w:val="595959"/>
+                <w:sz w:val="19"/>
+                <w:szCs w:val="19"/>
+              </w:rPr>
+              <w:t>-</w:t>
+            </w:r>
+            <w:r>
+              <w:rPr>
+                <w:color w:val="595959"/>
+                <w:sz w:val="19"/>
+                <w:szCs w:val="19"/>
+              </w:rPr>
+              <w:t xml:space="preserve"> Fernet symmetric key (local file)</w:t>
             </w:r>
           </w:p>
         </w:tc>
@@ -1871,25 +2063,7 @@
                 <w:sz w:val="20"/>
                 <w:szCs w:val="20"/>
               </w:rPr>
-              <w:t xml:space="preserve"> 4. New password validated against server-side policy 5. Password </w:t>
-            </w:r>
-            <w:proofErr w:type="gramStart"/>
-            <w:r>
-              <w:rPr>
-                <w:color w:val="000000"/>
-                <w:sz w:val="20"/>
-                <w:szCs w:val="20"/>
-              </w:rPr>
-              <w:t>hash</w:t>
-            </w:r>
-            <w:proofErr w:type="gramEnd"/>
-            <w:r>
-              <w:rPr>
-                <w:color w:val="000000"/>
-                <w:sz w:val="20"/>
-                <w:szCs w:val="20"/>
-              </w:rPr>
-              <w:t xml:space="preserve"> updated in </w:t>
+              <w:t xml:space="preserve"> 4. New password validated against server-side policy 5. Password hash updated in </w:t>
             </w:r>
             <w:proofErr w:type="spellStart"/>
             <w:proofErr w:type="gramStart"/>
@@ -2044,7 +2218,23 @@
                 <w:sz w:val="20"/>
                 <w:szCs w:val="20"/>
               </w:rPr>
-              <w:t>app.py — Route layer</w:t>
+              <w:t xml:space="preserve">app.py </w:t>
+            </w:r>
+            <w:r>
+              <w:rPr>
+                <w:color w:val="000000"/>
+                <w:sz w:val="20"/>
+                <w:szCs w:val="20"/>
+              </w:rPr>
+              <w:t>-</w:t>
+            </w:r>
+            <w:r>
+              <w:rPr>
+                <w:color w:val="000000"/>
+                <w:sz w:val="20"/>
+                <w:szCs w:val="20"/>
+              </w:rPr>
+              <w:t xml:space="preserve"> Route layer</w:t>
             </w:r>
           </w:p>
         </w:tc>
@@ -2075,43 +2265,7 @@
                 <w:sz w:val="20"/>
                 <w:szCs w:val="20"/>
               </w:rPr>
-              <w:t xml:space="preserve">Handles all HTTP routing. Every route that touches user data is protected </w:t>
-            </w:r>
-            <w:proofErr w:type="gramStart"/>
-            <w:r>
-              <w:rPr>
-                <w:color w:val="000000"/>
-                <w:sz w:val="20"/>
-                <w:szCs w:val="20"/>
-              </w:rPr>
-              <w:t>by @</w:t>
-            </w:r>
-            <w:proofErr w:type="gramEnd"/>
-            <w:r>
-              <w:rPr>
-                <w:color w:val="000000"/>
-                <w:sz w:val="20"/>
-                <w:szCs w:val="20"/>
-              </w:rPr>
-              <w:t xml:space="preserve">require_auth and, where </w:t>
-            </w:r>
-            <w:proofErr w:type="gramStart"/>
-            <w:r>
-              <w:rPr>
-                <w:color w:val="000000"/>
-                <w:sz w:val="20"/>
-                <w:szCs w:val="20"/>
-              </w:rPr>
-              <w:t>applicable, @</w:t>
-            </w:r>
-            <w:proofErr w:type="gramEnd"/>
-            <w:r>
-              <w:rPr>
-                <w:color w:val="000000"/>
-                <w:sz w:val="20"/>
-                <w:szCs w:val="20"/>
-              </w:rPr>
-              <w:t>require_role.</w:t>
+              <w:t>Handles all HTTP routing. Every route that touches user data is protected by @require_auth and, where applicable, @require_role.</w:t>
             </w:r>
           </w:p>
         </w:tc>
@@ -2177,25 +2331,7 @@
                 <w:sz w:val="20"/>
                 <w:szCs w:val="20"/>
               </w:rPr>
-              <w:t xml:space="preserve">Wraps all document I/O. Every </w:t>
-            </w:r>
-            <w:proofErr w:type="gramStart"/>
-            <w:r>
-              <w:rPr>
-                <w:color w:val="000000"/>
-                <w:sz w:val="20"/>
-                <w:szCs w:val="20"/>
-              </w:rPr>
-              <w:t>write</w:t>
-            </w:r>
-            <w:proofErr w:type="gramEnd"/>
-            <w:r>
-              <w:rPr>
-                <w:color w:val="000000"/>
-                <w:sz w:val="20"/>
-                <w:szCs w:val="20"/>
-              </w:rPr>
-              <w:t xml:space="preserve"> </w:t>
+              <w:t xml:space="preserve">Wraps all document I/O. Every write </w:t>
             </w:r>
             <w:proofErr w:type="gramStart"/>
             <w:r>
@@ -2623,23 +2759,13 @@
             <w:pPr>
               <w:spacing w:before="20" w:after="20"/>
             </w:pPr>
-            <w:proofErr w:type="gramStart"/>
-            <w:r>
-              <w:rPr>
-                <w:color w:val="000000"/>
-                <w:sz w:val="20"/>
-                <w:szCs w:val="20"/>
-              </w:rPr>
-              <w:t>Checks</w:t>
-            </w:r>
-            <w:proofErr w:type="gramEnd"/>
-            <w:r>
-              <w:rPr>
-                <w:color w:val="000000"/>
-                <w:sz w:val="20"/>
-                <w:szCs w:val="20"/>
-              </w:rPr>
-              <w:t xml:space="preserve"> the role field on the current session. On mismatch, logs ACCESS_DENIED and returns HTTP 403.</w:t>
+            <w:r>
+              <w:rPr>
+                <w:color w:val="000000"/>
+                <w:sz w:val="20"/>
+                <w:szCs w:val="20"/>
+              </w:rPr>
+              <w:t>Checks the role field on the current session. On mismatch, logs ACCESS_DENIED and returns HTTP 403.</w:t>
             </w:r>
           </w:p>
         </w:tc>
@@ -3085,25 +3211,7 @@
                 <w:sz w:val="20"/>
                 <w:szCs w:val="20"/>
               </w:rPr>
-              <w:t xml:space="preserve">Provides authenticated symmetric encryption (AES-128-CBC + HMAC-SHA256). Authentication means tampered ciphertext is detected at decryption time, not just at </w:t>
-            </w:r>
-            <w:proofErr w:type="gramStart"/>
-            <w:r>
-              <w:rPr>
-                <w:color w:val="000000"/>
-                <w:sz w:val="20"/>
-                <w:szCs w:val="20"/>
-              </w:rPr>
-              <w:t>read</w:t>
-            </w:r>
-            <w:proofErr w:type="gramEnd"/>
-            <w:r>
-              <w:rPr>
-                <w:color w:val="000000"/>
-                <w:sz w:val="20"/>
-                <w:szCs w:val="20"/>
-              </w:rPr>
-              <w:t xml:space="preserve"> time.</w:t>
+              <w:t>Provides authenticated symmetric encryption (AES-128-CBC + HMAC-SHA256). Authentication means tampered ciphertext is detected at decryption time, not just at read time.</w:t>
             </w:r>
           </w:p>
         </w:tc>
@@ -4832,25 +4940,7 @@
                 <w:sz w:val="20"/>
                 <w:szCs w:val="20"/>
               </w:rPr>
-              <w:t xml:space="preserve">Normal </w:t>
-            </w:r>
-            <w:proofErr w:type="gramStart"/>
-            <w:r>
-              <w:rPr>
-                <w:color w:val="000000"/>
-                <w:sz w:val="20"/>
-                <w:szCs w:val="20"/>
-              </w:rPr>
-              <w:t>user</w:t>
-            </w:r>
-            <w:proofErr w:type="gramEnd"/>
-            <w:r>
-              <w:rPr>
-                <w:color w:val="000000"/>
-                <w:sz w:val="20"/>
-                <w:szCs w:val="20"/>
-              </w:rPr>
-              <w:t xml:space="preserve"> accessing another user's document by guessing </w:t>
+              <w:t xml:space="preserve">Normal user accessing another user's document by guessing </w:t>
             </w:r>
             <w:proofErr w:type="spellStart"/>
             <w:r>
@@ -5206,7 +5296,23 @@
                 <w:sz w:val="20"/>
                 <w:szCs w:val="20"/>
               </w:rPr>
-              <w:t>CSRF — triggering state-changing actions from external sites</w:t>
+              <w:t xml:space="preserve">CSRF </w:t>
+            </w:r>
+            <w:r>
+              <w:rPr>
+                <w:color w:val="000000"/>
+                <w:sz w:val="20"/>
+                <w:szCs w:val="20"/>
+              </w:rPr>
+              <w:t xml:space="preserve">- </w:t>
+            </w:r>
+            <w:r>
+              <w:rPr>
+                <w:color w:val="000000"/>
+                <w:sz w:val="20"/>
+                <w:szCs w:val="20"/>
+              </w:rPr>
+              <w:t>triggering state-changing actions from external sites</w:t>
             </w:r>
           </w:p>
         </w:tc>
@@ -6101,23 +6207,13 @@
             <w:pPr>
               <w:spacing w:before="20" w:after="20"/>
             </w:pPr>
-            <w:proofErr w:type="gramStart"/>
-            <w:r>
-              <w:rPr>
-                <w:color w:val="000000"/>
-                <w:sz w:val="20"/>
-                <w:szCs w:val="20"/>
-              </w:rPr>
-              <w:t>Low (@</w:t>
-            </w:r>
-            <w:proofErr w:type="gramEnd"/>
-            <w:r>
-              <w:rPr>
-                <w:color w:val="000000"/>
-                <w:sz w:val="20"/>
-                <w:szCs w:val="20"/>
-              </w:rPr>
-              <w:t>require_role checks on all admin routes)</w:t>
+            <w:r>
+              <w:rPr>
+                <w:color w:val="000000"/>
+                <w:sz w:val="20"/>
+                <w:szCs w:val="20"/>
+              </w:rPr>
+              <w:t>Low (@require_role checks on all admin routes)</w:t>
             </w:r>
           </w:p>
         </w:tc>
@@ -6693,7 +6789,13 @@
         <w:pStyle w:val="Heading3"/>
       </w:pPr>
       <w:r>
-        <w:t>Scenario 1 — Credential Stuffing</w:t>
+        <w:t xml:space="preserve">Scenario 1 </w:t>
+      </w:r>
+      <w:r>
+        <w:t>-</w:t>
+      </w:r>
+      <w:r>
+        <w:t xml:space="preserve"> Credential Stuffing</w:t>
       </w:r>
     </w:p>
     <w:p>
@@ -6726,7 +6828,13 @@
         <w:pStyle w:val="Heading3"/>
       </w:pPr>
       <w:r>
-        <w:t>Scenario 2 — IDOR on Document Download</w:t>
+        <w:t xml:space="preserve">Scenario 2 </w:t>
+      </w:r>
+      <w:r>
+        <w:t>-</w:t>
+      </w:r>
+      <w:r>
+        <w:t xml:space="preserve"> IDOR on Document Download</w:t>
       </w:r>
     </w:p>
     <w:p>
@@ -6876,7 +6984,13 @@
         <w:pStyle w:val="Heading3"/>
       </w:pPr>
       <w:r>
-        <w:t xml:space="preserve">Scenario 3 — Path Traversal via </w:t>
+        <w:t xml:space="preserve">Scenario 3 </w:t>
+      </w:r>
+      <w:r>
+        <w:t>-</w:t>
+      </w:r>
+      <w:r>
+        <w:t xml:space="preserve"> Path Traversal via </w:t>
       </w:r>
       <w:proofErr w:type="spellStart"/>
       <w:r>
@@ -6965,7 +7079,7 @@
           <w:sz w:val="20"/>
           <w:szCs w:val="20"/>
         </w:rPr>
-        <w:t>(r'^[a-f0-9\</w:t>
+        <w:t>(r'^[a-f0-9\-]{</w:t>
       </w:r>
       <w:proofErr w:type="gramStart"/>
       <w:r>
@@ -6975,7 +7089,7 @@
           <w:sz w:val="20"/>
           <w:szCs w:val="20"/>
         </w:rPr>
-        <w:t>-]{36}$</w:t>
+        <w:t>36}$</w:t>
       </w:r>
       <w:proofErr w:type="gramEnd"/>
       <w:r>
@@ -6995,17 +7109,7 @@
           <w:sz w:val="20"/>
           <w:szCs w:val="20"/>
         </w:rPr>
-        <w:t>doc_</w:t>
-      </w:r>
-      <w:proofErr w:type="gramStart"/>
-      <w:r>
-        <w:rPr>
-          <w:rFonts w:ascii="Courier New" w:eastAsia="Courier New" w:hAnsi="Courier New" w:cs="Courier New"/>
-          <w:color w:val="8B0000"/>
-          <w:sz w:val="20"/>
-          <w:szCs w:val="20"/>
-        </w:rPr>
-        <w:t>id</w:t>
+        <w:t>doc_id</w:t>
       </w:r>
       <w:proofErr w:type="spellEnd"/>
       <w:r>
@@ -7018,9 +7122,11 @@
         <w:t>)</w:t>
       </w:r>
       <w:r>
-        <w:t xml:space="preserve"> —</w:t>
-      </w:r>
-      <w:proofErr w:type="gramEnd"/>
+        <w:t xml:space="preserve"> </w:t>
+      </w:r>
+      <w:r>
+        <w:t>-</w:t>
+      </w:r>
       <w:r>
         <w:t xml:space="preserve"> this does not match, so the request is immediately rejected with HTTP 400 and logged as PATH_TRAVERSAL_ATTEMPT.</w:t>
       </w:r>
@@ -7035,7 +7141,13 @@
         <w:pStyle w:val="Heading3"/>
       </w:pPr>
       <w:r>
-        <w:t>Scenario 4 — Session Replay after Logout</w:t>
+        <w:t xml:space="preserve">Scenario 4 </w:t>
+      </w:r>
+      <w:r>
+        <w:t>-</w:t>
+      </w:r>
+      <w:r>
+        <w:t xml:space="preserve"> Session Replay after Logout</w:t>
       </w:r>
     </w:p>
     <w:p>
@@ -7092,11 +7204,9 @@
       <w:r>
         <w:t xml:space="preserve">B.5 Risk </w:t>
       </w:r>
-      <w:proofErr w:type="spellStart"/>
-      <w:r>
-        <w:t>Prioritisation</w:t>
-      </w:r>
-      <w:proofErr w:type="spellEnd"/>
+      <w:r>
+        <w:t>Prioritization</w:t>
+      </w:r>
     </w:p>
     <w:p>
       <w:pPr>
@@ -7402,7 +7512,23 @@
                 <w:sz w:val="20"/>
                 <w:szCs w:val="20"/>
               </w:rPr>
-              <w:t>Open — see Known Limitations</w:t>
+              <w:t xml:space="preserve">Open </w:t>
+            </w:r>
+            <w:r>
+              <w:rPr>
+                <w:color w:val="000000"/>
+                <w:sz w:val="20"/>
+                <w:szCs w:val="20"/>
+              </w:rPr>
+              <w:t>-</w:t>
+            </w:r>
+            <w:r>
+              <w:rPr>
+                <w:color w:val="000000"/>
+                <w:sz w:val="20"/>
+                <w:szCs w:val="20"/>
+              </w:rPr>
+              <w:t xml:space="preserve"> see Known Limitations</w:t>
             </w:r>
           </w:p>
         </w:tc>
@@ -7497,7 +7623,23 @@
                 <w:sz w:val="20"/>
                 <w:szCs w:val="20"/>
               </w:rPr>
-              <w:t>Open — see Known Limitations</w:t>
+              <w:t xml:space="preserve">Open </w:t>
+            </w:r>
+            <w:r>
+              <w:rPr>
+                <w:color w:val="000000"/>
+                <w:sz w:val="20"/>
+                <w:szCs w:val="20"/>
+              </w:rPr>
+              <w:t>-</w:t>
+            </w:r>
+            <w:r>
+              <w:rPr>
+                <w:color w:val="000000"/>
+                <w:sz w:val="20"/>
+                <w:szCs w:val="20"/>
+              </w:rPr>
+              <w:t xml:space="preserve"> see Known Limitations</w:t>
             </w:r>
           </w:p>
         </w:tc>
@@ -7592,7 +7734,23 @@
                 <w:sz w:val="20"/>
                 <w:szCs w:val="20"/>
               </w:rPr>
-              <w:t>Open — see Known Limitations</w:t>
+              <w:t xml:space="preserve">Open </w:t>
+            </w:r>
+            <w:r>
+              <w:rPr>
+                <w:color w:val="000000"/>
+                <w:sz w:val="20"/>
+                <w:szCs w:val="20"/>
+              </w:rPr>
+              <w:t>-</w:t>
+            </w:r>
+            <w:r>
+              <w:rPr>
+                <w:color w:val="000000"/>
+                <w:sz w:val="20"/>
+                <w:szCs w:val="20"/>
+              </w:rPr>
+              <w:t xml:space="preserve"> see Known Limitations</w:t>
             </w:r>
           </w:p>
         </w:tc>
@@ -7991,15 +8149,7 @@
         <w:t>(rounds=12))</w:t>
       </w:r>
       <w:r>
-        <w:t xml:space="preserve"> before storage. The plaintext password is never written </w:t>
-      </w:r>
-      <w:proofErr w:type="gramStart"/>
-      <w:r>
-        <w:t>to disk</w:t>
-      </w:r>
-      <w:proofErr w:type="gramEnd"/>
-      <w:r>
-        <w:t xml:space="preserve"> or logged. Cost factor 12 makes offline brute-force expensive.</w:t>
+        <w:t xml:space="preserve"> before storage. The plaintext password is never written to disk or logged. Cost factor 12 makes offline brute-force expensive.</w:t>
       </w:r>
     </w:p>
     <w:p>
@@ -8881,6 +9031,7 @@
                 <w:sz w:val="20"/>
                 <w:szCs w:val="20"/>
               </w:rPr>
+              <w:lastRenderedPageBreak/>
               <w:t>Edit own content</w:t>
             </w:r>
           </w:p>
@@ -9818,26 +9969,6 @@
         </w:rPr>
         <w:t>* Guests can view documents that have been explicitly shared with them (as viewer), but cannot create, edit, delete, or share content. Owner, editor, and viewer are document-level access permissions, not account roles.</w:t>
       </w:r>
-      <w:proofErr w:type="gramStart"/>
-      <w:r>
-        <w:rPr>
-          <w:i/>
-          <w:iCs/>
-          <w:color w:val="595959"/>
-          <w:sz w:val="19"/>
-          <w:szCs w:val="19"/>
-        </w:rPr>
-      </w:r>
-      <w:proofErr w:type="gramEnd"/>
-      <w:r>
-        <w:rPr>
-          <w:i/>
-          <w:iCs/>
-          <w:color w:val="595959"/>
-          <w:sz w:val="19"/>
-          <w:szCs w:val="19"/>
-        </w:rPr>
-      </w:r>
     </w:p>
     <w:p>
       <w:pPr>
@@ -9860,7 +9991,13 @@
       </w:r>
       <w:proofErr w:type="spellEnd"/>
       <w:r>
-        <w:t xml:space="preserve"> with the appropriate role? This prevents horizontal privilege escalation — a normal user cannot access another normal user's document even with a valid session.</w:t>
+        <w:t xml:space="preserve"> with the appropriate role? This prevents horizontal privilege escalation </w:t>
+      </w:r>
+      <w:r>
+        <w:t>-</w:t>
+      </w:r>
+      <w:r>
+        <w:t xml:space="preserve"> a normal user cannot access another normal user's document even with a valid session.</w:t>
       </w:r>
     </w:p>
     <w:p>
@@ -10128,7 +10265,7 @@
           <w:sz w:val="20"/>
           <w:szCs w:val="20"/>
         </w:rPr>
-        <w:t>(r'^[a-f0-9\</w:t>
+        <w:t>(r'^[a-f0-9\-]{</w:t>
       </w:r>
       <w:proofErr w:type="gramStart"/>
       <w:r>
@@ -10138,7 +10275,7 @@
           <w:sz w:val="20"/>
           <w:szCs w:val="20"/>
         </w:rPr>
-        <w:t>-]{36}$</w:t>
+        <w:t>36}$</w:t>
       </w:r>
       <w:proofErr w:type="gramEnd"/>
       <w:r>
@@ -10381,24 +10518,10 @@
           <w:sz w:val="20"/>
           <w:szCs w:val="20"/>
         </w:rPr>
-        <w:t xml:space="preserve">, jpg, </w:t>
-      </w:r>
-      <w:proofErr w:type="gramStart"/>
-      <w:r>
-        <w:rPr>
-          <w:rFonts w:ascii="Courier New" w:eastAsia="Courier New" w:hAnsi="Courier New" w:cs="Courier New"/>
-          <w:color w:val="8B0000"/>
-          <w:sz w:val="20"/>
-          <w:szCs w:val="20"/>
-        </w:rPr>
-        <w:t>jpeg}</w:t>
-      </w:r>
-      <w:r>
-        <w:t>)</w:t>
-      </w:r>
-      <w:proofErr w:type="gramEnd"/>
-      <w:r>
-        <w:t xml:space="preserve"> and the MIME type (</w:t>
+        <w:t>, jpg, jpeg}</w:t>
+      </w:r>
+      <w:r>
+        <w:t>) and the MIME type (</w:t>
       </w:r>
       <w:r>
         <w:rPr>
@@ -10448,7 +10571,13 @@
         <w:spacing w:before="40" w:after="40"/>
       </w:pPr>
       <w:r>
-        <w:t>Username: 3–20 characters, alphanumeric + underscore only (regex enforced server-side)</w:t>
+        <w:t>Username: 3</w:t>
+      </w:r>
+      <w:r>
+        <w:t>-</w:t>
+      </w:r>
+      <w:r>
+        <w:t>20 characters, alphanumeric + underscore only (regex enforced server-side)</w:t>
       </w:r>
     </w:p>
     <w:p>
@@ -10461,15 +10590,7 @@
         <w:spacing w:before="40" w:after="40"/>
       </w:pPr>
       <w:r>
-        <w:t xml:space="preserve">Email: basic format validation via regex (presence </w:t>
-      </w:r>
-      <w:proofErr w:type="gramStart"/>
-      <w:r>
-        <w:t>of @</w:t>
-      </w:r>
-      <w:proofErr w:type="gramEnd"/>
-      <w:r>
-        <w:t xml:space="preserve"> and domain dot)</w:t>
+        <w:t>Email: basic format validation via regex (presence of @ and domain dot)</w:t>
       </w:r>
     </w:p>
     <w:p>
@@ -10495,7 +10616,13 @@
         <w:spacing w:before="40" w:after="40"/>
       </w:pPr>
       <w:r>
-        <w:t>Sharing role: validated against a whitelist — only 'editor' or 'viewer' accepted</w:t>
+        <w:t xml:space="preserve">Sharing role: validated against a whitelist </w:t>
+      </w:r>
+      <w:r>
+        <w:t>-</w:t>
+      </w:r>
+      <w:r>
+        <w:t xml:space="preserve"> only 'editor' or 'viewer' accepted</w:t>
       </w:r>
     </w:p>
     <w:p>
@@ -10620,25 +10747,7 @@
                 <w:sz w:val="21"/>
                 <w:szCs w:val="21"/>
               </w:rPr>
-              <w:t xml:space="preserve"> → HTTP 400, logged. Uploaded .exe file → rejected. Uploaded valid </w:t>
-            </w:r>
-            <w:proofErr w:type="gramStart"/>
-            <w:r>
-              <w:rPr>
-                <w:color w:val="2E75B6"/>
-                <w:sz w:val="21"/>
-                <w:szCs w:val="21"/>
-              </w:rPr>
-              <w:t>file</w:t>
-            </w:r>
-            <w:proofErr w:type="gramEnd"/>
-            <w:r>
-              <w:rPr>
-                <w:color w:val="2E75B6"/>
-                <w:sz w:val="21"/>
-                <w:szCs w:val="21"/>
-              </w:rPr>
-              <w:t xml:space="preserve"> over 10 MB → rejected.</w:t>
+              <w:t xml:space="preserve"> → HTTP 400, logged. Uploaded .exe file → rejected. Uploaded valid file over 10 MB → rejected.</w:t>
             </w:r>
           </w:p>
         </w:tc>
@@ -10754,7 +10863,13 @@
         <w:t>()</w:t>
       </w:r>
       <w:r>
-        <w:t xml:space="preserve"> verifies the HMAC before returning the plaintext — tampered ciphertext raises an exception rather than returning garbage data.</w:t>
+        <w:t xml:space="preserve"> verifies the HMAC before returning the plaintext </w:t>
+      </w:r>
+      <w:r>
+        <w:t>-</w:t>
+      </w:r>
+      <w:r>
+        <w:t xml:space="preserve"> tampered ciphertext raises an exception rather than returning garbage data.</w:t>
       </w:r>
     </w:p>
     <w:p>
@@ -11055,7 +11170,39 @@
                 <w:sz w:val="21"/>
                 <w:szCs w:val="21"/>
               </w:rPr>
-              <w:t xml:space="preserve">Testing: Opened a .enc file in a hex editor — confirmed only ciphertext visible, no plaintext filename or content. Modified one byte of the ciphertext, restarted app, and attempted to load the file — Fernet raised </w:t>
+              <w:t xml:space="preserve">Testing: Opened a .enc file in a hex editor </w:t>
+            </w:r>
+            <w:r>
+              <w:rPr>
+                <w:color w:val="2E75B6"/>
+                <w:sz w:val="21"/>
+                <w:szCs w:val="21"/>
+              </w:rPr>
+              <w:t>-</w:t>
+            </w:r>
+            <w:r>
+              <w:rPr>
+                <w:color w:val="2E75B6"/>
+                <w:sz w:val="21"/>
+                <w:szCs w:val="21"/>
+              </w:rPr>
+              <w:t xml:space="preserve"> confirmed only ciphertext visible, no plaintext filename or content. Modified one byte of the ciphertext, restarted app, and attempted to load the file </w:t>
+            </w:r>
+            <w:r>
+              <w:rPr>
+                <w:color w:val="2E75B6"/>
+                <w:sz w:val="21"/>
+                <w:szCs w:val="21"/>
+              </w:rPr>
+              <w:t>-</w:t>
+            </w:r>
+            <w:r>
+              <w:rPr>
+                <w:color w:val="2E75B6"/>
+                <w:sz w:val="21"/>
+                <w:szCs w:val="21"/>
+              </w:rPr>
+              <w:t xml:space="preserve"> Fernet raised </w:t>
             </w:r>
             <w:proofErr w:type="spellStart"/>
             <w:r>
@@ -11356,32 +11503,19 @@
         <w:t xml:space="preserve"> &gt; SESSION_TIMEOUT (1800 s)</w:t>
       </w:r>
       <w:r>
-        <w:t xml:space="preserve">. An expired session is </w:t>
+        <w:t>. An expired session is deleted server-</w:t>
       </w:r>
       <w:proofErr w:type="gramStart"/>
       <w:r>
-        <w:t>deleted</w:t>
+        <w:t>side</w:t>
       </w:r>
       <w:proofErr w:type="gramEnd"/>
       <w:r>
-        <w:t xml:space="preserve"> server-</w:t>
-      </w:r>
-      <w:proofErr w:type="gramStart"/>
-      <w:r>
-        <w:t>side</w:t>
-      </w:r>
-      <w:proofErr w:type="gramEnd"/>
-      <w:r>
         <w:t xml:space="preserve"> and the client cookie is cleared. </w:t>
       </w:r>
       <w:proofErr w:type="spellStart"/>
-      <w:proofErr w:type="gramStart"/>
-      <w:r>
-        <w:t>last</w:t>
-      </w:r>
-      <w:proofErr w:type="gramEnd"/>
-      <w:r>
-        <w:t>_activity</w:t>
+      <w:r>
+        <w:t>last_activity</w:t>
       </w:r>
       <w:proofErr w:type="spellEnd"/>
       <w:r>
@@ -11505,7 +11639,13 @@
       </w:r>
       <w:proofErr w:type="spellEnd"/>
       <w:r>
-        <w:t>=True — cookie is inaccessible to JavaScript, reducing XSS-based session theft</w:t>
+        <w:t xml:space="preserve">=True </w:t>
+      </w:r>
+      <w:r>
+        <w:t>-</w:t>
+      </w:r>
+      <w:r>
+        <w:t xml:space="preserve"> cookie is inaccessible to JavaScript, reducing XSS-based session theft</w:t>
       </w:r>
     </w:p>
     <w:p>
@@ -11518,7 +11658,13 @@
         <w:spacing w:before="40" w:after="40"/>
       </w:pPr>
       <w:r>
-        <w:t>Secure=True — cookie is only sent over HTTPS connections</w:t>
+        <w:t xml:space="preserve">Secure=True </w:t>
+      </w:r>
+      <w:r>
+        <w:t>-</w:t>
+      </w:r>
+      <w:r>
+        <w:t xml:space="preserve"> cookie is only sent over HTTPS connections</w:t>
       </w:r>
     </w:p>
     <w:p>
@@ -11536,13 +11682,11 @@
       </w:r>
       <w:proofErr w:type="spellEnd"/>
       <w:r>
-        <w:t>='</w:t>
-      </w:r>
-      <w:proofErr w:type="gramStart"/>
-      <w:r>
-        <w:t>Strict' —</w:t>
-      </w:r>
-      <w:proofErr w:type="gramEnd"/>
+        <w:t xml:space="preserve">='Strict' </w:t>
+      </w:r>
+      <w:r>
+        <w:t>-</w:t>
+      </w:r>
       <w:r>
         <w:t xml:space="preserve"> cookie is not sent on cross-site requests, providing CSRF protection without a dedicated token</w:t>
       </w:r>
@@ -11597,25 +11741,7 @@
                 <w:sz w:val="21"/>
                 <w:szCs w:val="21"/>
               </w:rPr>
-              <w:t xml:space="preserve">Testing: Logged in, captured session token, logged out, replayed </w:t>
-            </w:r>
-            <w:proofErr w:type="gramStart"/>
-            <w:r>
-              <w:rPr>
-                <w:color w:val="2E75B6"/>
-                <w:sz w:val="21"/>
-                <w:szCs w:val="21"/>
-              </w:rPr>
-              <w:t>token</w:t>
-            </w:r>
-            <w:proofErr w:type="gramEnd"/>
-            <w:r>
-              <w:rPr>
-                <w:color w:val="2E75B6"/>
-                <w:sz w:val="21"/>
-                <w:szCs w:val="21"/>
-              </w:rPr>
-              <w:t xml:space="preserve"> in a fresh request → redirected to login. Confirmed session entry was absent from </w:t>
+              <w:t xml:space="preserve">Testing: Logged in, captured session token, logged out, replayed token in a fresh request → redirected to login. Confirmed session entry was absent from </w:t>
             </w:r>
             <w:proofErr w:type="spellStart"/>
             <w:proofErr w:type="gramStart"/>
@@ -12023,7 +12149,23 @@
                 <w:sz w:val="20"/>
                 <w:szCs w:val="20"/>
               </w:rPr>
-              <w:t xml:space="preserve">DENY — prevents clickjacking via </w:t>
+              <w:t xml:space="preserve">DENY </w:t>
+            </w:r>
+            <w:r>
+              <w:rPr>
+                <w:color w:val="000000"/>
+                <w:sz w:val="20"/>
+                <w:szCs w:val="20"/>
+              </w:rPr>
+              <w:t>-</w:t>
+            </w:r>
+            <w:r>
+              <w:rPr>
+                <w:color w:val="000000"/>
+                <w:sz w:val="20"/>
+                <w:szCs w:val="20"/>
+              </w:rPr>
+              <w:t xml:space="preserve"> prevents clickjacking via </w:t>
             </w:r>
             <w:proofErr w:type="spellStart"/>
             <w:r>
@@ -12116,7 +12258,23 @@
                 <w:sz w:val="20"/>
                 <w:szCs w:val="20"/>
               </w:rPr>
-              <w:t xml:space="preserve"> — prevents MIME-type sniffing attacks</w:t>
+              <w:t xml:space="preserve"> </w:t>
+            </w:r>
+            <w:r>
+              <w:rPr>
+                <w:color w:val="000000"/>
+                <w:sz w:val="20"/>
+                <w:szCs w:val="20"/>
+              </w:rPr>
+              <w:t>-</w:t>
+            </w:r>
+            <w:r>
+              <w:rPr>
+                <w:color w:val="000000"/>
+                <w:sz w:val="20"/>
+                <w:szCs w:val="20"/>
+              </w:rPr>
+              <w:t xml:space="preserve"> prevents MIME-type sniffing attacks</w:t>
             </w:r>
           </w:p>
         </w:tc>
@@ -12180,7 +12338,23 @@
                 <w:sz w:val="20"/>
                 <w:szCs w:val="20"/>
               </w:rPr>
-              <w:t>1; mode=block — legacy XSS filter for older browsers</w:t>
+              <w:t xml:space="preserve">1; mode=block </w:t>
+            </w:r>
+            <w:r>
+              <w:rPr>
+                <w:color w:val="000000"/>
+                <w:sz w:val="20"/>
+                <w:szCs w:val="20"/>
+              </w:rPr>
+              <w:t>-</w:t>
+            </w:r>
+            <w:r>
+              <w:rPr>
+                <w:color w:val="000000"/>
+                <w:sz w:val="20"/>
+                <w:szCs w:val="20"/>
+              </w:rPr>
+              <w:t xml:space="preserve"> legacy XSS filter for older browsers</w:t>
             </w:r>
           </w:p>
         </w:tc>
@@ -12244,7 +12418,23 @@
                 <w:sz w:val="20"/>
                 <w:szCs w:val="20"/>
               </w:rPr>
-              <w:t>strict-origin-when-cross-origin — limits referrer leakage</w:t>
+              <w:t xml:space="preserve">strict-origin-when-cross-origin </w:t>
+            </w:r>
+            <w:r>
+              <w:rPr>
+                <w:color w:val="000000"/>
+                <w:sz w:val="20"/>
+                <w:szCs w:val="20"/>
+              </w:rPr>
+              <w:t>-</w:t>
+            </w:r>
+            <w:r>
+              <w:rPr>
+                <w:color w:val="000000"/>
+                <w:sz w:val="20"/>
+                <w:szCs w:val="20"/>
+              </w:rPr>
+              <w:t xml:space="preserve"> limits referrer leakage</w:t>
             </w:r>
           </w:p>
         </w:tc>
@@ -12362,7 +12552,23 @@
                 <w:sz w:val="20"/>
                 <w:szCs w:val="20"/>
               </w:rPr>
-              <w:t>) — disables unused browser APIs</w:t>
+              <w:t xml:space="preserve">) </w:t>
+            </w:r>
+            <w:r>
+              <w:rPr>
+                <w:color w:val="000000"/>
+                <w:sz w:val="20"/>
+                <w:szCs w:val="20"/>
+              </w:rPr>
+              <w:t>-</w:t>
+            </w:r>
+            <w:r>
+              <w:rPr>
+                <w:color w:val="000000"/>
+                <w:sz w:val="20"/>
+                <w:szCs w:val="20"/>
+              </w:rPr>
+              <w:t xml:space="preserve"> disables unused browser APIs</w:t>
             </w:r>
           </w:p>
         </w:tc>
@@ -12444,7 +12650,23 @@
                 <w:sz w:val="20"/>
                 <w:szCs w:val="20"/>
               </w:rPr>
-              <w:t xml:space="preserve"> — enforces HTTPS for 1 year</w:t>
+              <w:t xml:space="preserve"> </w:t>
+            </w:r>
+            <w:r>
+              <w:rPr>
+                <w:color w:val="000000"/>
+                <w:sz w:val="20"/>
+                <w:szCs w:val="20"/>
+              </w:rPr>
+              <w:t>-</w:t>
+            </w:r>
+            <w:r>
+              <w:rPr>
+                <w:color w:val="000000"/>
+                <w:sz w:val="20"/>
+                <w:szCs w:val="20"/>
+              </w:rPr>
+              <w:t xml:space="preserve"> enforces HTTPS for 1 year</w:t>
             </w:r>
           </w:p>
         </w:tc>
@@ -12468,15 +12690,7 @@
         <w:spacing w:before="60" w:after="60"/>
       </w:pPr>
       <w:r>
-        <w:t xml:space="preserve">Two separate loggers write JSON-structured entries to </w:t>
-      </w:r>
-      <w:proofErr w:type="gramStart"/>
-      <w:r>
-        <w:t>distinct</w:t>
-      </w:r>
-      <w:proofErr w:type="gramEnd"/>
-      <w:r>
-        <w:t xml:space="preserve"> log files:</w:t>
+        <w:t>Two separate loggers write JSON-structured entries to distinct log files:</w:t>
       </w:r>
     </w:p>
     <w:p>
@@ -12636,25 +12850,7 @@
                 <w:sz w:val="20"/>
                 <w:szCs w:val="20"/>
               </w:rPr>
-              <w:t xml:space="preserve">LOGIN_FAILED, LOGIN_BLOCKED, ACCOUNT_LOCKED, SESSION_CREATED, SESSION_DESTROYED, ACCESS_DENIED, UPLOAD_REJECTED, PATH_TRAVERSAL_ATTEMPT, PASSWORD_CHANGE_FAILED, PASSWORD_CHANGED, ADMIN_USER_LOCKED, </w:t>
-            </w:r>
-            <w:proofErr w:type="gramStart"/>
-            <w:r>
-              <w:rPr>
-                <w:color w:val="000000"/>
-                <w:sz w:val="20"/>
-                <w:szCs w:val="20"/>
-              </w:rPr>
-              <w:t>ADMIN</w:t>
-            </w:r>
-            <w:proofErr w:type="gramEnd"/>
-            <w:r>
-              <w:rPr>
-                <w:color w:val="000000"/>
-                <w:sz w:val="20"/>
-                <w:szCs w:val="20"/>
-              </w:rPr>
-              <w:t>_USER_UNLOCKED, RATE_LIMITED, FILE_LOAD_ERROR</w:t>
+              <w:t>LOGIN_FAILED, LOGIN_BLOCKED, ACCOUNT_LOCKED, SESSION_CREATED, SESSION_DESTROYED, ACCESS_DENIED, UPLOAD_REJECTED, PATH_TRAVERSAL_ATTEMPT, PASSWORD_CHANGE_FAILED, PASSWORD_CHANGED, ADMIN_USER_LOCKED, ADMIN_USER_UNLOCKED, RATE_LIMITED, FILE_LOAD_ERROR</w:t>
             </w:r>
           </w:p>
         </w:tc>
@@ -14279,25 +14475,7 @@
                 <w:sz w:val="20"/>
                 <w:szCs w:val="20"/>
               </w:rPr>
-              <w:t xml:space="preserve">Compromise decrypts all stored documents. Requires </w:t>
-            </w:r>
-            <w:proofErr w:type="gramStart"/>
-            <w:r>
-              <w:rPr>
-                <w:color w:val="000000"/>
-                <w:sz w:val="20"/>
-                <w:szCs w:val="20"/>
-              </w:rPr>
-              <w:t>strongest</w:t>
-            </w:r>
-            <w:proofErr w:type="gramEnd"/>
-            <w:r>
-              <w:rPr>
-                <w:color w:val="000000"/>
-                <w:sz w:val="20"/>
-                <w:szCs w:val="20"/>
-              </w:rPr>
-              <w:t xml:space="preserve"> protection.</w:t>
+              <w:t>Compromise decrypts all stored documents. Requires strongest protection.</w:t>
             </w:r>
           </w:p>
         </w:tc>
@@ -14330,25 +14508,7 @@
                 <w:sz w:val="20"/>
                 <w:szCs w:val="20"/>
               </w:rPr>
-              <w:t xml:space="preserve">User </w:t>
-            </w:r>
-            <w:proofErr w:type="gramStart"/>
-            <w:r>
-              <w:rPr>
-                <w:color w:val="000000"/>
-                <w:sz w:val="20"/>
-                <w:szCs w:val="20"/>
-              </w:rPr>
-              <w:t>metadata</w:t>
-            </w:r>
-            <w:proofErr w:type="gramEnd"/>
-            <w:r>
-              <w:rPr>
-                <w:color w:val="000000"/>
-                <w:sz w:val="20"/>
-                <w:szCs w:val="20"/>
-              </w:rPr>
-              <w:t xml:space="preserve"> (email, role, lockout)</w:t>
+              <w:t>User metadata (email, role, lockout)</w:t>
             </w:r>
           </w:p>
         </w:tc>
@@ -14751,25 +14911,7 @@
                 <w:sz w:val="20"/>
                 <w:szCs w:val="20"/>
               </w:rPr>
-              <w:t xml:space="preserve">Contains IPs and usernames. </w:t>
-            </w:r>
-            <w:proofErr w:type="gramStart"/>
-            <w:r>
-              <w:rPr>
-                <w:color w:val="000000"/>
-                <w:sz w:val="20"/>
-                <w:szCs w:val="20"/>
-              </w:rPr>
-              <w:t>Should</w:t>
-            </w:r>
-            <w:proofErr w:type="gramEnd"/>
-            <w:r>
-              <w:rPr>
-                <w:color w:val="000000"/>
-                <w:sz w:val="20"/>
-                <w:szCs w:val="20"/>
-              </w:rPr>
-              <w:t xml:space="preserve"> not be publicly accessible.</w:t>
+              <w:t>Contains IPs and usernames. Should not be publicly accessible.</w:t>
             </w:r>
           </w:p>
         </w:tc>
@@ -15120,7 +15262,23 @@
                 <w:sz w:val="20"/>
                 <w:szCs w:val="20"/>
               </w:rPr>
-              <w:t>) — every write is a fresh encryption with a new IV. Authenticated encryption detects tampering.</w:t>
+              <w:t xml:space="preserve">) </w:t>
+            </w:r>
+            <w:r>
+              <w:rPr>
+                <w:color w:val="000000"/>
+                <w:sz w:val="20"/>
+                <w:szCs w:val="20"/>
+              </w:rPr>
+              <w:t>-</w:t>
+            </w:r>
+            <w:r>
+              <w:rPr>
+                <w:color w:val="000000"/>
+                <w:sz w:val="20"/>
+                <w:szCs w:val="20"/>
+              </w:rPr>
+              <w:t xml:space="preserve"> every write is a fresh encryption with a new IV. Authenticated encryption detects tampering.</w:t>
             </w:r>
           </w:p>
         </w:tc>
@@ -15253,7 +15411,23 @@
                 <w:sz w:val="20"/>
                 <w:szCs w:val="20"/>
               </w:rPr>
-              <w:t xml:space="preserve">) — salted, slow KDF. Verification via </w:t>
+              <w:t xml:space="preserve">) </w:t>
+            </w:r>
+            <w:r>
+              <w:rPr>
+                <w:color w:val="000000"/>
+                <w:sz w:val="20"/>
+                <w:szCs w:val="20"/>
+              </w:rPr>
+              <w:t>-</w:t>
+            </w:r>
+            <w:r>
+              <w:rPr>
+                <w:color w:val="000000"/>
+                <w:sz w:val="20"/>
+                <w:szCs w:val="20"/>
+              </w:rPr>
+              <w:t xml:space="preserve"> salted, slow KDF. Verification via </w:t>
             </w:r>
             <w:proofErr w:type="spellStart"/>
             <w:proofErr w:type="gramStart"/>
@@ -15273,25 +15447,7 @@
                 <w:sz w:val="20"/>
                 <w:szCs w:val="20"/>
               </w:rPr>
-              <w:t xml:space="preserve">() only; </w:t>
-            </w:r>
-            <w:proofErr w:type="gramStart"/>
-            <w:r>
-              <w:rPr>
-                <w:color w:val="000000"/>
-                <w:sz w:val="20"/>
-                <w:szCs w:val="20"/>
-              </w:rPr>
-              <w:t>hash</w:t>
-            </w:r>
-            <w:proofErr w:type="gramEnd"/>
-            <w:r>
-              <w:rPr>
-                <w:color w:val="000000"/>
-                <w:sz w:val="20"/>
-                <w:szCs w:val="20"/>
-              </w:rPr>
-              <w:t xml:space="preserve"> never logged.</w:t>
+              <w:t>() only; hash never logged.</w:t>
             </w:r>
           </w:p>
         </w:tc>
@@ -15355,7 +15511,23 @@
                 <w:sz w:val="20"/>
                 <w:szCs w:val="20"/>
               </w:rPr>
-              <w:t xml:space="preserve">CSPRNG — </w:t>
+              <w:t xml:space="preserve">CSPRNG </w:t>
+            </w:r>
+            <w:r>
+              <w:rPr>
+                <w:color w:val="000000"/>
+                <w:sz w:val="20"/>
+                <w:szCs w:val="20"/>
+              </w:rPr>
+              <w:t>-</w:t>
+            </w:r>
+            <w:r>
+              <w:rPr>
+                <w:color w:val="000000"/>
+                <w:sz w:val="20"/>
+                <w:szCs w:val="20"/>
+              </w:rPr>
+              <w:t xml:space="preserve"> </w:t>
             </w:r>
             <w:proofErr w:type="spellStart"/>
             <w:proofErr w:type="gramStart"/>
@@ -15581,25 +15753,7 @@
                 <w:sz w:val="20"/>
                 <w:szCs w:val="20"/>
               </w:rPr>
-              <w:t>Self-</w:t>
-            </w:r>
-            <w:proofErr w:type="gramStart"/>
-            <w:r>
-              <w:rPr>
-                <w:color w:val="000000"/>
-                <w:sz w:val="20"/>
-                <w:szCs w:val="20"/>
-              </w:rPr>
-              <w:t>signed</w:t>
-            </w:r>
-            <w:proofErr w:type="gramEnd"/>
-            <w:r>
-              <w:rPr>
-                <w:color w:val="000000"/>
-                <w:sz w:val="20"/>
-                <w:szCs w:val="20"/>
-              </w:rPr>
-              <w:t xml:space="preserve"> certificate for dev. Production deployment requires a CA-signed certificate.</w:t>
+              <w:t>Self-signed certificate for dev. Production deployment requires a CA-signed certificate.</w:t>
             </w:r>
           </w:p>
         </w:tc>
@@ -15697,15 +15851,7 @@
       </w:r>
       <w:proofErr w:type="spellEnd"/>
       <w:r>
-        <w:t xml:space="preserve"> in the project root. Access is controlled by OS </w:t>
-      </w:r>
-      <w:proofErr w:type="gramStart"/>
-      <w:r>
-        <w:t>filesystem</w:t>
-      </w:r>
-      <w:proofErr w:type="gramEnd"/>
-      <w:r>
-        <w:t xml:space="preserve"> permissions. The key is not committed to version control (</w:t>
+        <w:t xml:space="preserve"> in the project root. Access is controlled by OS filesystem permissions. The key is not committed to version control (</w:t>
       </w:r>
       <w:proofErr w:type="spellStart"/>
       <w:r>
@@ -15781,7 +15927,13 @@
         <w:spacing w:before="40" w:after="40"/>
       </w:pPr>
       <w:r>
-        <w:t>Backup: None for the class project. In production, the key must be backed up securely — losing it makes all .enc files permanently unreadable.</w:t>
+        <w:t xml:space="preserve">Backup: None for the class project. In production, the key must be backed up securely </w:t>
+      </w:r>
+      <w:r>
+        <w:t>-</w:t>
+      </w:r>
+      <w:r>
+        <w:t xml:space="preserve"> losing it makes all .enc files permanently unreadable.</w:t>
       </w:r>
     </w:p>
     <w:p>

</xml_diff>